<commit_message>
added horizontal grid and horizontal hover lines
</commit_message>
<xml_diff>
--- a/debug_timeseries.docx
+++ b/debug_timeseries.docx
@@ -12,12 +12,12 @@
     </w:p>
     <w:p>
       <w:r>
-        <w:t>Grid Point: Lat 0.7000, Lon 36.5000</w:t>
+        <w:t>Grid Point: Lat -0.8000, Lon 37.0000</w:t>
       </w:r>
     </w:p>
     <w:p>
       <w:r>
-        <w:t>Date Range: 2020-01-01 → 2020-01-31</w:t>
+        <w:t>Date Range: 2020-01-01 → 2020-02-01</w:t>
       </w:r>
     </w:p>
     <w:p/>
@@ -152,7 +152,7 @@
               <w:rPr>
                 <w:rFonts w:ascii="Calibri" w:hAnsi="Calibri"/>
               </w:rPr>
-              <w:t>0.7</w:t>
+              <w:t>-0.8</w:t>
             </w:r>
           </w:p>
         </w:tc>
@@ -165,7 +165,7 @@
               <w:rPr>
                 <w:rFonts w:ascii="Calibri" w:hAnsi="Calibri"/>
               </w:rPr>
-              <w:t>36.5</w:t>
+              <w:t>37.0</w:t>
             </w:r>
           </w:p>
         </w:tc>
@@ -191,7 +191,7 @@
               <w:rPr>
                 <w:rFonts w:ascii="Calibri" w:hAnsi="Calibri"/>
               </w:rPr>
-              <w:t>296.89038</w:t>
+              <w:t>294.39087</w:t>
             </w:r>
           </w:p>
         </w:tc>
@@ -232,7 +232,7 @@
               <w:rPr>
                 <w:rFonts w:ascii="Calibri" w:hAnsi="Calibri"/>
               </w:rPr>
-              <w:t>0.7</w:t>
+              <w:t>-0.8</w:t>
             </w:r>
           </w:p>
         </w:tc>
@@ -245,7 +245,7 @@
               <w:rPr>
                 <w:rFonts w:ascii="Calibri" w:hAnsi="Calibri"/>
               </w:rPr>
-              <w:t>36.5</w:t>
+              <w:t>37.0</w:t>
             </w:r>
           </w:p>
         </w:tc>
@@ -271,7 +271,7 @@
               <w:rPr>
                 <w:rFonts w:ascii="Calibri" w:hAnsi="Calibri"/>
               </w:rPr>
-              <w:t>295.9187</w:t>
+              <w:t>294.10498</w:t>
             </w:r>
           </w:p>
         </w:tc>
@@ -312,7 +312,7 @@
               <w:rPr>
                 <w:rFonts w:ascii="Calibri" w:hAnsi="Calibri"/>
               </w:rPr>
-              <w:t>0.7</w:t>
+              <w:t>-0.8</w:t>
             </w:r>
           </w:p>
         </w:tc>
@@ -325,7 +325,7 @@
               <w:rPr>
                 <w:rFonts w:ascii="Calibri" w:hAnsi="Calibri"/>
               </w:rPr>
-              <w:t>36.5</w:t>
+              <w:t>37.0</w:t>
             </w:r>
           </w:p>
         </w:tc>
@@ -351,7 +351,7 @@
               <w:rPr>
                 <w:rFonts w:ascii="Calibri" w:hAnsi="Calibri"/>
               </w:rPr>
-              <w:t>295.44873</w:t>
+              <w:t>293.33057</w:t>
             </w:r>
           </w:p>
         </w:tc>
@@ -392,7 +392,7 @@
               <w:rPr>
                 <w:rFonts w:ascii="Calibri" w:hAnsi="Calibri"/>
               </w:rPr>
-              <w:t>0.7</w:t>
+              <w:t>-0.8</w:t>
             </w:r>
           </w:p>
         </w:tc>
@@ -405,7 +405,7 @@
               <w:rPr>
                 <w:rFonts w:ascii="Calibri" w:hAnsi="Calibri"/>
               </w:rPr>
-              <w:t>36.5</w:t>
+              <w:t>37.0</w:t>
             </w:r>
           </w:p>
         </w:tc>
@@ -431,7 +431,7 @@
               <w:rPr>
                 <w:rFonts w:ascii="Calibri" w:hAnsi="Calibri"/>
               </w:rPr>
-              <w:t>296.77222</w:t>
+              <w:t>293.5078</w:t>
             </w:r>
           </w:p>
         </w:tc>
@@ -472,7 +472,7 @@
               <w:rPr>
                 <w:rFonts w:ascii="Calibri" w:hAnsi="Calibri"/>
               </w:rPr>
-              <w:t>0.7</w:t>
+              <w:t>-0.8</w:t>
             </w:r>
           </w:p>
         </w:tc>
@@ -485,7 +485,7 @@
               <w:rPr>
                 <w:rFonts w:ascii="Calibri" w:hAnsi="Calibri"/>
               </w:rPr>
-              <w:t>36.5</w:t>
+              <w:t>37.0</w:t>
             </w:r>
           </w:p>
         </w:tc>
@@ -511,7 +511,7 @@
               <w:rPr>
                 <w:rFonts w:ascii="Calibri" w:hAnsi="Calibri"/>
               </w:rPr>
-              <w:t>296.96924</w:t>
+              <w:t>294.5642</w:t>
             </w:r>
           </w:p>
         </w:tc>
@@ -552,7 +552,7 @@
               <w:rPr>
                 <w:rFonts w:ascii="Calibri" w:hAnsi="Calibri"/>
               </w:rPr>
-              <w:t>0.7</w:t>
+              <w:t>-0.8</w:t>
             </w:r>
           </w:p>
         </w:tc>
@@ -565,7 +565,7 @@
               <w:rPr>
                 <w:rFonts w:ascii="Calibri" w:hAnsi="Calibri"/>
               </w:rPr>
-              <w:t>36.5</w:t>
+              <w:t>37.0</w:t>
             </w:r>
           </w:p>
         </w:tc>
@@ -591,7 +591,7 @@
               <w:rPr>
                 <w:rFonts w:ascii="Calibri" w:hAnsi="Calibri"/>
               </w:rPr>
-              <w:t>296.9829</w:t>
+              <w:t>295.14233</w:t>
             </w:r>
           </w:p>
         </w:tc>
@@ -632,7 +632,7 @@
               <w:rPr>
                 <w:rFonts w:ascii="Calibri" w:hAnsi="Calibri"/>
               </w:rPr>
-              <w:t>0.7</w:t>
+              <w:t>-0.8</w:t>
             </w:r>
           </w:p>
         </w:tc>
@@ -645,7 +645,7 @@
               <w:rPr>
                 <w:rFonts w:ascii="Calibri" w:hAnsi="Calibri"/>
               </w:rPr>
-              <w:t>36.5</w:t>
+              <w:t>37.0</w:t>
             </w:r>
           </w:p>
         </w:tc>
@@ -671,7 +671,7 @@
               <w:rPr>
                 <w:rFonts w:ascii="Calibri" w:hAnsi="Calibri"/>
               </w:rPr>
-              <w:t>296.73438</w:t>
+              <w:t>293.85767</w:t>
             </w:r>
           </w:p>
         </w:tc>
@@ -712,7 +712,7 @@
               <w:rPr>
                 <w:rFonts w:ascii="Calibri" w:hAnsi="Calibri"/>
               </w:rPr>
-              <w:t>0.7</w:t>
+              <w:t>-0.8</w:t>
             </w:r>
           </w:p>
         </w:tc>
@@ -725,7 +725,7 @@
               <w:rPr>
                 <w:rFonts w:ascii="Calibri" w:hAnsi="Calibri"/>
               </w:rPr>
-              <w:t>36.5</w:t>
+              <w:t>37.0</w:t>
             </w:r>
           </w:p>
         </w:tc>
@@ -751,7 +751,7 @@
               <w:rPr>
                 <w:rFonts w:ascii="Calibri" w:hAnsi="Calibri"/>
               </w:rPr>
-              <w:t>296.3794</w:t>
+              <w:t>293.63135</w:t>
             </w:r>
           </w:p>
         </w:tc>
@@ -792,7 +792,7 @@
               <w:rPr>
                 <w:rFonts w:ascii="Calibri" w:hAnsi="Calibri"/>
               </w:rPr>
-              <w:t>0.7</w:t>
+              <w:t>-0.8</w:t>
             </w:r>
           </w:p>
         </w:tc>
@@ -805,7 +805,7 @@
               <w:rPr>
                 <w:rFonts w:ascii="Calibri" w:hAnsi="Calibri"/>
               </w:rPr>
-              <w:t>36.5</w:t>
+              <w:t>37.0</w:t>
             </w:r>
           </w:p>
         </w:tc>
@@ -831,7 +831,7 @@
               <w:rPr>
                 <w:rFonts w:ascii="Calibri" w:hAnsi="Calibri"/>
               </w:rPr>
-              <w:t>295.76294</w:t>
+              <w:t>293.98096</w:t>
             </w:r>
           </w:p>
         </w:tc>
@@ -872,7 +872,7 @@
               <w:rPr>
                 <w:rFonts w:ascii="Calibri" w:hAnsi="Calibri"/>
               </w:rPr>
-              <w:t>0.7</w:t>
+              <w:t>-0.8</w:t>
             </w:r>
           </w:p>
         </w:tc>
@@ -885,7 +885,7 @@
               <w:rPr>
                 <w:rFonts w:ascii="Calibri" w:hAnsi="Calibri"/>
               </w:rPr>
-              <w:t>36.5</w:t>
+              <w:t>37.0</w:t>
             </w:r>
           </w:p>
         </w:tc>
@@ -911,7 +911,7 @@
               <w:rPr>
                 <w:rFonts w:ascii="Calibri" w:hAnsi="Calibri"/>
               </w:rPr>
-              <w:t>298.0891</w:t>
+              <w:t>295.33008</w:t>
             </w:r>
           </w:p>
         </w:tc>
@@ -952,7 +952,7 @@
               <w:rPr>
                 <w:rFonts w:ascii="Calibri" w:hAnsi="Calibri"/>
               </w:rPr>
-              <w:t>0.7</w:t>
+              <w:t>-0.8</w:t>
             </w:r>
           </w:p>
         </w:tc>
@@ -965,7 +965,7 @@
               <w:rPr>
                 <w:rFonts w:ascii="Calibri" w:hAnsi="Calibri"/>
               </w:rPr>
-              <w:t>36.5</w:t>
+              <w:t>37.0</w:t>
             </w:r>
           </w:p>
         </w:tc>
@@ -991,7 +991,7 @@
               <w:rPr>
                 <w:rFonts w:ascii="Calibri" w:hAnsi="Calibri"/>
               </w:rPr>
-              <w:t>296.94922</w:t>
+              <w:t>295.1848</w:t>
             </w:r>
           </w:p>
         </w:tc>
@@ -1032,7 +1032,7 @@
               <w:rPr>
                 <w:rFonts w:ascii="Calibri" w:hAnsi="Calibri"/>
               </w:rPr>
-              <w:t>0.7</w:t>
+              <w:t>-0.8</w:t>
             </w:r>
           </w:p>
         </w:tc>
@@ -1045,7 +1045,7 @@
               <w:rPr>
                 <w:rFonts w:ascii="Calibri" w:hAnsi="Calibri"/>
               </w:rPr>
-              <w:t>36.5</w:t>
+              <w:t>37.0</w:t>
             </w:r>
           </w:p>
         </w:tc>
@@ -1071,7 +1071,7 @@
               <w:rPr>
                 <w:rFonts w:ascii="Calibri" w:hAnsi="Calibri"/>
               </w:rPr>
-              <w:t>294.36743</w:t>
+              <w:t>293.78516</w:t>
             </w:r>
           </w:p>
         </w:tc>
@@ -1112,7 +1112,7 @@
               <w:rPr>
                 <w:rFonts w:ascii="Calibri" w:hAnsi="Calibri"/>
               </w:rPr>
-              <w:t>0.7</w:t>
+              <w:t>-0.8</w:t>
             </w:r>
           </w:p>
         </w:tc>
@@ -1125,7 +1125,7 @@
               <w:rPr>
                 <w:rFonts w:ascii="Calibri" w:hAnsi="Calibri"/>
               </w:rPr>
-              <w:t>36.5</w:t>
+              <w:t>37.0</w:t>
             </w:r>
           </w:p>
         </w:tc>
@@ -1151,7 +1151,7 @@
               <w:rPr>
                 <w:rFonts w:ascii="Calibri" w:hAnsi="Calibri"/>
               </w:rPr>
-              <w:t>293.72388</w:t>
+              <w:t>292.93286</w:t>
             </w:r>
           </w:p>
         </w:tc>
@@ -1192,7 +1192,7 @@
               <w:rPr>
                 <w:rFonts w:ascii="Calibri" w:hAnsi="Calibri"/>
               </w:rPr>
-              <w:t>0.7</w:t>
+              <w:t>-0.8</w:t>
             </w:r>
           </w:p>
         </w:tc>
@@ -1205,7 +1205,7 @@
               <w:rPr>
                 <w:rFonts w:ascii="Calibri" w:hAnsi="Calibri"/>
               </w:rPr>
-              <w:t>36.5</w:t>
+              <w:t>37.0</w:t>
             </w:r>
           </w:p>
         </w:tc>
@@ -1231,7 +1231,7 @@
               <w:rPr>
                 <w:rFonts w:ascii="Calibri" w:hAnsi="Calibri"/>
               </w:rPr>
-              <w:t>295.53955</w:t>
+              <w:t>294.3694</w:t>
             </w:r>
           </w:p>
         </w:tc>
@@ -1272,7 +1272,7 @@
               <w:rPr>
                 <w:rFonts w:ascii="Calibri" w:hAnsi="Calibri"/>
               </w:rPr>
-              <w:t>0.7</w:t>
+              <w:t>-0.8</w:t>
             </w:r>
           </w:p>
         </w:tc>
@@ -1285,7 +1285,7 @@
               <w:rPr>
                 <w:rFonts w:ascii="Calibri" w:hAnsi="Calibri"/>
               </w:rPr>
-              <w:t>36.5</w:t>
+              <w:t>37.0</w:t>
             </w:r>
           </w:p>
         </w:tc>
@@ -1311,7 +1311,7 @@
               <w:rPr>
                 <w:rFonts w:ascii="Calibri" w:hAnsi="Calibri"/>
               </w:rPr>
-              <w:t>297.58813</w:t>
+              <w:t>294.8108</w:t>
             </w:r>
           </w:p>
         </w:tc>
@@ -1352,7 +1352,7 @@
               <w:rPr>
                 <w:rFonts w:ascii="Calibri" w:hAnsi="Calibri"/>
               </w:rPr>
-              <w:t>0.7</w:t>
+              <w:t>-0.8</w:t>
             </w:r>
           </w:p>
         </w:tc>
@@ -1365,7 +1365,7 @@
               <w:rPr>
                 <w:rFonts w:ascii="Calibri" w:hAnsi="Calibri"/>
               </w:rPr>
-              <w:t>36.5</w:t>
+              <w:t>37.0</w:t>
             </w:r>
           </w:p>
         </w:tc>
@@ -1391,7 +1391,7 @@
               <w:rPr>
                 <w:rFonts w:ascii="Calibri" w:hAnsi="Calibri"/>
               </w:rPr>
-              <w:t>296.7854</w:t>
+              <w:t>293.84082</w:t>
             </w:r>
           </w:p>
         </w:tc>
@@ -1432,7 +1432,7 @@
               <w:rPr>
                 <w:rFonts w:ascii="Calibri" w:hAnsi="Calibri"/>
               </w:rPr>
-              <w:t>0.7</w:t>
+              <w:t>-0.8</w:t>
             </w:r>
           </w:p>
         </w:tc>
@@ -1445,7 +1445,7 @@
               <w:rPr>
                 <w:rFonts w:ascii="Calibri" w:hAnsi="Calibri"/>
               </w:rPr>
-              <w:t>36.5</w:t>
+              <w:t>37.0</w:t>
             </w:r>
           </w:p>
         </w:tc>
@@ -1471,7 +1471,7 @@
               <w:rPr>
                 <w:rFonts w:ascii="Calibri" w:hAnsi="Calibri"/>
               </w:rPr>
-              <w:t>298.22144</w:t>
+              <w:t>295.00854</w:t>
             </w:r>
           </w:p>
         </w:tc>
@@ -1512,7 +1512,7 @@
               <w:rPr>
                 <w:rFonts w:ascii="Calibri" w:hAnsi="Calibri"/>
               </w:rPr>
-              <w:t>0.7</w:t>
+              <w:t>-0.8</w:t>
             </w:r>
           </w:p>
         </w:tc>
@@ -1525,7 +1525,7 @@
               <w:rPr>
                 <w:rFonts w:ascii="Calibri" w:hAnsi="Calibri"/>
               </w:rPr>
-              <w:t>36.5</w:t>
+              <w:t>37.0</w:t>
             </w:r>
           </w:p>
         </w:tc>
@@ -1551,7 +1551,7 @@
               <w:rPr>
                 <w:rFonts w:ascii="Calibri" w:hAnsi="Calibri"/>
               </w:rPr>
-              <w:t>299.11157</w:t>
+              <w:t>295.65454</w:t>
             </w:r>
           </w:p>
         </w:tc>
@@ -1592,7 +1592,7 @@
               <w:rPr>
                 <w:rFonts w:ascii="Calibri" w:hAnsi="Calibri"/>
               </w:rPr>
-              <w:t>0.7</w:t>
+              <w:t>-0.8</w:t>
             </w:r>
           </w:p>
         </w:tc>
@@ -1605,7 +1605,7 @@
               <w:rPr>
                 <w:rFonts w:ascii="Calibri" w:hAnsi="Calibri"/>
               </w:rPr>
-              <w:t>36.5</w:t>
+              <w:t>37.0</w:t>
             </w:r>
           </w:p>
         </w:tc>
@@ -1631,7 +1631,7 @@
               <w:rPr>
                 <w:rFonts w:ascii="Calibri" w:hAnsi="Calibri"/>
               </w:rPr>
-              <w:t>299.05176</w:t>
+              <w:t>295.67603</w:t>
             </w:r>
           </w:p>
         </w:tc>
@@ -1672,7 +1672,7 @@
               <w:rPr>
                 <w:rFonts w:ascii="Calibri" w:hAnsi="Calibri"/>
               </w:rPr>
-              <w:t>0.7</w:t>
+              <w:t>-0.8</w:t>
             </w:r>
           </w:p>
         </w:tc>
@@ -1685,7 +1685,7 @@
               <w:rPr>
                 <w:rFonts w:ascii="Calibri" w:hAnsi="Calibri"/>
               </w:rPr>
-              <w:t>36.5</w:t>
+              <w:t>37.0</w:t>
             </w:r>
           </w:p>
         </w:tc>
@@ -1711,7 +1711,7 @@
               <w:rPr>
                 <w:rFonts w:ascii="Calibri" w:hAnsi="Calibri"/>
               </w:rPr>
-              <w:t>298.83936</w:t>
+              <w:t>296.48535</w:t>
             </w:r>
           </w:p>
         </w:tc>
@@ -1752,7 +1752,7 @@
               <w:rPr>
                 <w:rFonts w:ascii="Calibri" w:hAnsi="Calibri"/>
               </w:rPr>
-              <w:t>0.7</w:t>
+              <w:t>-0.8</w:t>
             </w:r>
           </w:p>
         </w:tc>
@@ -1765,7 +1765,7 @@
               <w:rPr>
                 <w:rFonts w:ascii="Calibri" w:hAnsi="Calibri"/>
               </w:rPr>
-              <w:t>36.5</w:t>
+              <w:t>37.0</w:t>
             </w:r>
           </w:p>
         </w:tc>
@@ -1791,7 +1791,7 @@
               <w:rPr>
                 <w:rFonts w:ascii="Calibri" w:hAnsi="Calibri"/>
               </w:rPr>
-              <w:t>298.20337</w:t>
+              <w:t>296.10034</w:t>
             </w:r>
           </w:p>
         </w:tc>
@@ -1832,7 +1832,7 @@
               <w:rPr>
                 <w:rFonts w:ascii="Calibri" w:hAnsi="Calibri"/>
               </w:rPr>
-              <w:t>0.7</w:t>
+              <w:t>-0.8</w:t>
             </w:r>
           </w:p>
         </w:tc>
@@ -1845,7 +1845,7 @@
               <w:rPr>
                 <w:rFonts w:ascii="Calibri" w:hAnsi="Calibri"/>
               </w:rPr>
-              <w:t>36.5</w:t>
+              <w:t>37.0</w:t>
             </w:r>
           </w:p>
         </w:tc>
@@ -1871,7 +1871,7 @@
               <w:rPr>
                 <w:rFonts w:ascii="Calibri" w:hAnsi="Calibri"/>
               </w:rPr>
-              <w:t>297.8562</w:t>
+              <w:t>294.7788</w:t>
             </w:r>
           </w:p>
         </w:tc>
@@ -1912,7 +1912,7 @@
               <w:rPr>
                 <w:rFonts w:ascii="Calibri" w:hAnsi="Calibri"/>
               </w:rPr>
-              <w:t>0.7</w:t>
+              <w:t>-0.8</w:t>
             </w:r>
           </w:p>
         </w:tc>
@@ -1925,7 +1925,7 @@
               <w:rPr>
                 <w:rFonts w:ascii="Calibri" w:hAnsi="Calibri"/>
               </w:rPr>
-              <w:t>36.5</w:t>
+              <w:t>37.0</w:t>
             </w:r>
           </w:p>
         </w:tc>
@@ -1951,7 +1951,7 @@
               <w:rPr>
                 <w:rFonts w:ascii="Calibri" w:hAnsi="Calibri"/>
               </w:rPr>
-              <w:t>297.23853</w:t>
+              <w:t>294.29614</w:t>
             </w:r>
           </w:p>
         </w:tc>
@@ -1992,7 +1992,7 @@
               <w:rPr>
                 <w:rFonts w:ascii="Calibri" w:hAnsi="Calibri"/>
               </w:rPr>
-              <w:t>0.7</w:t>
+              <w:t>-0.8</w:t>
             </w:r>
           </w:p>
         </w:tc>
@@ -2005,7 +2005,7 @@
               <w:rPr>
                 <w:rFonts w:ascii="Calibri" w:hAnsi="Calibri"/>
               </w:rPr>
-              <w:t>36.5</w:t>
+              <w:t>37.0</w:t>
             </w:r>
           </w:p>
         </w:tc>
@@ -2031,7 +2031,7 @@
               <w:rPr>
                 <w:rFonts w:ascii="Calibri" w:hAnsi="Calibri"/>
               </w:rPr>
-              <w:t>295.437</w:t>
+              <w:t>292.8811</w:t>
             </w:r>
           </w:p>
         </w:tc>
@@ -2072,7 +2072,7 @@
               <w:rPr>
                 <w:rFonts w:ascii="Calibri" w:hAnsi="Calibri"/>
               </w:rPr>
-              <w:t>0.7</w:t>
+              <w:t>-0.8</w:t>
             </w:r>
           </w:p>
         </w:tc>
@@ -2085,7 +2085,7 @@
               <w:rPr>
                 <w:rFonts w:ascii="Calibri" w:hAnsi="Calibri"/>
               </w:rPr>
-              <w:t>36.5</w:t>
+              <w:t>37.0</w:t>
             </w:r>
           </w:p>
         </w:tc>
@@ -2111,7 +2111,7 @@
               <w:rPr>
                 <w:rFonts w:ascii="Calibri" w:hAnsi="Calibri"/>
               </w:rPr>
-              <w:t>295.2268</w:t>
+              <w:t>293.8667</w:t>
             </w:r>
           </w:p>
         </w:tc>
@@ -2152,7 +2152,7 @@
               <w:rPr>
                 <w:rFonts w:ascii="Calibri" w:hAnsi="Calibri"/>
               </w:rPr>
-              <w:t>0.7</w:t>
+              <w:t>-0.8</w:t>
             </w:r>
           </w:p>
         </w:tc>
@@ -2165,7 +2165,7 @@
               <w:rPr>
                 <w:rFonts w:ascii="Calibri" w:hAnsi="Calibri"/>
               </w:rPr>
-              <w:t>36.5</w:t>
+              <w:t>37.0</w:t>
             </w:r>
           </w:p>
         </w:tc>
@@ -2191,7 +2191,7 @@
               <w:rPr>
                 <w:rFonts w:ascii="Calibri" w:hAnsi="Calibri"/>
               </w:rPr>
-              <w:t>294.5796</w:t>
+              <w:t>292.37598</w:t>
             </w:r>
           </w:p>
         </w:tc>
@@ -2232,7 +2232,7 @@
               <w:rPr>
                 <w:rFonts w:ascii="Calibri" w:hAnsi="Calibri"/>
               </w:rPr>
-              <w:t>0.7</w:t>
+              <w:t>-0.8</w:t>
             </w:r>
           </w:p>
         </w:tc>
@@ -2245,7 +2245,7 @@
               <w:rPr>
                 <w:rFonts w:ascii="Calibri" w:hAnsi="Calibri"/>
               </w:rPr>
-              <w:t>36.5</w:t>
+              <w:t>37.0</w:t>
             </w:r>
           </w:p>
         </w:tc>
@@ -2271,7 +2271,7 @@
               <w:rPr>
                 <w:rFonts w:ascii="Calibri" w:hAnsi="Calibri"/>
               </w:rPr>
-              <w:t>293.2859</w:t>
+              <w:t>292.07153</w:t>
             </w:r>
           </w:p>
         </w:tc>
@@ -2312,7 +2312,7 @@
               <w:rPr>
                 <w:rFonts w:ascii="Calibri" w:hAnsi="Calibri"/>
               </w:rPr>
-              <w:t>0.7</w:t>
+              <w:t>-0.8</w:t>
             </w:r>
           </w:p>
         </w:tc>
@@ -2325,7 +2325,7 @@
               <w:rPr>
                 <w:rFonts w:ascii="Calibri" w:hAnsi="Calibri"/>
               </w:rPr>
-              <w:t>36.5</w:t>
+              <w:t>37.0</w:t>
             </w:r>
           </w:p>
         </w:tc>
@@ -2351,7 +2351,7 @@
               <w:rPr>
                 <w:rFonts w:ascii="Calibri" w:hAnsi="Calibri"/>
               </w:rPr>
-              <w:t>292.79517</w:t>
+              <w:t>291.5952</w:t>
             </w:r>
           </w:p>
         </w:tc>
@@ -2392,7 +2392,7 @@
               <w:rPr>
                 <w:rFonts w:ascii="Calibri" w:hAnsi="Calibri"/>
               </w:rPr>
-              <w:t>0.7</w:t>
+              <w:t>-0.8</w:t>
             </w:r>
           </w:p>
         </w:tc>
@@ -2405,7 +2405,7 @@
               <w:rPr>
                 <w:rFonts w:ascii="Calibri" w:hAnsi="Calibri"/>
               </w:rPr>
-              <w:t>36.5</w:t>
+              <w:t>37.0</w:t>
             </w:r>
           </w:p>
         </w:tc>
@@ -2431,7 +2431,7 @@
               <w:rPr>
                 <w:rFonts w:ascii="Calibri" w:hAnsi="Calibri"/>
               </w:rPr>
-              <w:t>293.7151</w:t>
+              <w:t>293.20532</w:t>
             </w:r>
           </w:p>
         </w:tc>
@@ -2472,7 +2472,7 @@
               <w:rPr>
                 <w:rFonts w:ascii="Calibri" w:hAnsi="Calibri"/>
               </w:rPr>
-              <w:t>0.7</w:t>
+              <w:t>-0.8</w:t>
             </w:r>
           </w:p>
         </w:tc>
@@ -2485,7 +2485,7 @@
               <w:rPr>
                 <w:rFonts w:ascii="Calibri" w:hAnsi="Calibri"/>
               </w:rPr>
-              <w:t>36.5</w:t>
+              <w:t>37.0</w:t>
             </w:r>
           </w:p>
         </w:tc>
@@ -2511,7 +2511,87 @@
               <w:rPr>
                 <w:rFonts w:ascii="Calibri" w:hAnsi="Calibri"/>
               </w:rPr>
-              <w:t>295.21143</w:t>
+              <w:t>292.77905</w:t>
+            </w:r>
+          </w:p>
+        </w:tc>
+      </w:tr>
+      <w:tr>
+        <w:tc>
+          <w:tcPr>
+            <w:tcW w:type="dxa" w:w="1440"/>
+          </w:tcPr>
+          <w:p>
+            <w:r>
+              <w:rPr>
+                <w:rFonts w:ascii="Calibri" w:hAnsi="Calibri"/>
+              </w:rPr>
+              <w:t>2020-01-31 15:00:00</w:t>
+            </w:r>
+          </w:p>
+        </w:tc>
+        <w:tc>
+          <w:tcPr>
+            <w:tcW w:type="dxa" w:w="1440"/>
+          </w:tcPr>
+          <w:p>
+            <w:r>
+              <w:rPr>
+                <w:rFonts w:ascii="Calibri" w:hAnsi="Calibri"/>
+              </w:rPr>
+              <w:t>0</w:t>
+            </w:r>
+          </w:p>
+        </w:tc>
+        <w:tc>
+          <w:tcPr>
+            <w:tcW w:type="dxa" w:w="1440"/>
+          </w:tcPr>
+          <w:p>
+            <w:r>
+              <w:rPr>
+                <w:rFonts w:ascii="Calibri" w:hAnsi="Calibri"/>
+              </w:rPr>
+              <w:t>-0.8</w:t>
+            </w:r>
+          </w:p>
+        </w:tc>
+        <w:tc>
+          <w:tcPr>
+            <w:tcW w:type="dxa" w:w="1440"/>
+          </w:tcPr>
+          <w:p>
+            <w:r>
+              <w:rPr>
+                <w:rFonts w:ascii="Calibri" w:hAnsi="Calibri"/>
+              </w:rPr>
+              <w:t>37.0</w:t>
+            </w:r>
+          </w:p>
+        </w:tc>
+        <w:tc>
+          <w:tcPr>
+            <w:tcW w:type="dxa" w:w="1440"/>
+          </w:tcPr>
+          <w:p>
+            <w:r>
+              <w:rPr>
+                <w:rFonts w:ascii="Calibri" w:hAnsi="Calibri"/>
+              </w:rPr>
+              <w:t>0001</w:t>
+            </w:r>
+          </w:p>
+        </w:tc>
+        <w:tc>
+          <w:tcPr>
+            <w:tcW w:type="dxa" w:w="1440"/>
+          </w:tcPr>
+          <w:p>
+            <w:r>
+              <w:rPr>
+                <w:rFonts w:ascii="Calibri" w:hAnsi="Calibri"/>
+              </w:rPr>
+              <w:t>294.88892</w:t>
             </w:r>
           </w:p>
         </w:tc>

</xml_diff>